<commit_message>
Data Analytics SimBook: book shell and CM sim hooks
Reuse the SimBook engine with Data Analytics branding and units, add a
code block type for Sheets formulas and pandas, and link each CM lesson
to its SimBook sim.

Co-Authored-By: Claude Opus 5.5 <noreply@anthropic.com>
Claude-Session: https://claude.ai/code/session_017G5QYgrCTCFugkQCNFUaXc
</commit_message>
<xml_diff>
--- a/courses/data-analytics/output/DataAnalytics-CM-SY2026-2027.docx
+++ b/courses/data-analytics/output/DataAnalytics-CM-SY2026-2027.docx
@@ -3822,6 +3822,44 @@
             <w:r>
               <w:rPr>
                 <w:rFonts w:ascii="Arial" w:hAnsi="Arial" w:eastAsia="Arial"/>
+                <w:b/>
+                <w:i w:val="0"/>
+                <w:color w:val="38761D"/>
+                <w:sz w:val="18"/>
+              </w:rPr>
+              <w:t>SIM HOOK:</w:t>
+            </w:r>
+            <w:r>
+              <w:rPr>
+                <w:rFonts w:ascii="Arial" w:hAnsi="Arial" w:eastAsia="Arial"/>
+                <w:b w:val="0"/>
+                <w:i w:val="0"/>
+                <w:sz w:val="18"/>
+              </w:rPr>
+              <w:t xml:space="preserve"> SimBook – Data Lens (Sort the Data, Life Cycle, Which Analysis?)</w:t>
+            </w:r>
+          </w:p>
+          <w:p>
+            <w:pPr>
+              <w:tabs>
+                <w:tab w:pos="220" w:val="left"/>
+              </w:tabs>
+              <w:spacing w:before="0" w:after="40" w:line="240" w:lineRule="auto"/>
+              <w:ind w:left="220" w:hanging="220"/>
+            </w:pPr>
+            <w:r>
+              <w:rPr>
+                <w:rFonts w:ascii="Arial" w:hAnsi="Arial" w:eastAsia="Arial"/>
+                <w:b w:val="0"/>
+                <w:i w:val="0"/>
+                <w:sz w:val="18"/>
+              </w:rPr>
+              <w:t>3.</w:t>
+              <w:tab/>
+            </w:r>
+            <w:r>
+              <w:rPr>
+                <w:rFonts w:ascii="Arial" w:hAnsi="Arial" w:eastAsia="Arial"/>
                 <w:b w:val="0"/>
                 <w:i w:val="0"/>
                 <w:sz w:val="18"/>
@@ -3844,7 +3882,7 @@
                 <w:i w:val="0"/>
                 <w:sz w:val="18"/>
               </w:rPr>
-              <w:t>3.</w:t>
+              <w:t>4.</w:t>
               <w:tab/>
             </w:r>
             <w:r>
@@ -3868,6 +3906,34 @@
               <w:end w:w="80" w:type="dxa"/>
             </w:tcMar>
           </w:tcPr>
+          <w:p>
+            <w:pPr>
+              <w:tabs>
+                <w:tab w:pos="220" w:val="left"/>
+              </w:tabs>
+              <w:spacing w:before="0" w:after="40" w:line="240" w:lineRule="auto"/>
+              <w:ind w:left="220" w:hanging="220"/>
+            </w:pPr>
+            <w:r>
+              <w:rPr>
+                <w:rFonts w:ascii="Arial" w:hAnsi="Arial" w:eastAsia="Arial"/>
+                <w:b w:val="0"/>
+                <w:i w:val="0"/>
+                <w:sz w:val="18"/>
+              </w:rPr>
+              <w:t>•</w:t>
+              <w:tab/>
+            </w:r>
+            <w:r>
+              <w:rPr>
+                <w:rFonts w:ascii="Arial" w:hAnsi="Arial" w:eastAsia="Arial"/>
+                <w:b w:val="0"/>
+                <w:i w:val="0"/>
+                <w:sz w:val="18"/>
+              </w:rPr>
+              <w:t>Data Analytics SimBook – Lesson 1 (hook sim, lesson slides with notes, and Exercises)</w:t>
+            </w:r>
+          </w:p>
           <w:p>
             <w:pPr>
               <w:tabs>
@@ -4440,6 +4506,44 @@
             <w:r>
               <w:rPr>
                 <w:rFonts w:ascii="Arial" w:hAnsi="Arial" w:eastAsia="Arial"/>
+                <w:b/>
+                <w:i w:val="0"/>
+                <w:color w:val="38761D"/>
+                <w:sz w:val="18"/>
+              </w:rPr>
+              <w:t>SIM HOOK:</w:t>
+            </w:r>
+            <w:r>
+              <w:rPr>
+                <w:rFonts w:ascii="Arial" w:hAnsi="Arial" w:eastAsia="Arial"/>
+                <w:b w:val="0"/>
+                <w:i w:val="0"/>
+                <w:sz w:val="18"/>
+              </w:rPr>
+              <w:t xml:space="preserve"> SimBook – Privacy Shield (Anonymize, Ethics Calls)</w:t>
+            </w:r>
+          </w:p>
+          <w:p>
+            <w:pPr>
+              <w:tabs>
+                <w:tab w:pos="220" w:val="left"/>
+              </w:tabs>
+              <w:spacing w:before="0" w:after="40" w:line="240" w:lineRule="auto"/>
+              <w:ind w:left="220" w:hanging="220"/>
+            </w:pPr>
+            <w:r>
+              <w:rPr>
+                <w:rFonts w:ascii="Arial" w:hAnsi="Arial" w:eastAsia="Arial"/>
+                <w:b w:val="0"/>
+                <w:i w:val="0"/>
+                <w:sz w:val="18"/>
+              </w:rPr>
+              <w:t>3.</w:t>
+              <w:tab/>
+            </w:r>
+            <w:r>
+              <w:rPr>
+                <w:rFonts w:ascii="Arial" w:hAnsi="Arial" w:eastAsia="Arial"/>
                 <w:b w:val="0"/>
                 <w:i w:val="0"/>
                 <w:sz w:val="18"/>
@@ -4462,7 +4566,7 @@
                 <w:i w:val="0"/>
                 <w:sz w:val="18"/>
               </w:rPr>
-              <w:t>3.</w:t>
+              <w:t>4.</w:t>
               <w:tab/>
             </w:r>
             <w:r>
@@ -4486,6 +4590,34 @@
               <w:end w:w="80" w:type="dxa"/>
             </w:tcMar>
           </w:tcPr>
+          <w:p>
+            <w:pPr>
+              <w:tabs>
+                <w:tab w:pos="220" w:val="left"/>
+              </w:tabs>
+              <w:spacing w:before="0" w:after="40" w:line="240" w:lineRule="auto"/>
+              <w:ind w:left="220" w:hanging="220"/>
+            </w:pPr>
+            <w:r>
+              <w:rPr>
+                <w:rFonts w:ascii="Arial" w:hAnsi="Arial" w:eastAsia="Arial"/>
+                <w:b w:val="0"/>
+                <w:i w:val="0"/>
+                <w:sz w:val="18"/>
+              </w:rPr>
+              <w:t>•</w:t>
+              <w:tab/>
+            </w:r>
+            <w:r>
+              <w:rPr>
+                <w:rFonts w:ascii="Arial" w:hAnsi="Arial" w:eastAsia="Arial"/>
+                <w:b w:val="0"/>
+                <w:i w:val="0"/>
+                <w:sz w:val="18"/>
+              </w:rPr>
+              <w:t>Data Analytics SimBook – Lesson 2 (hook sim, lesson slides with notes, and Exercises)</w:t>
+            </w:r>
+          </w:p>
           <w:p>
             <w:pPr>
               <w:tabs>
@@ -5016,6 +5148,44 @@
             <w:r>
               <w:rPr>
                 <w:rFonts w:ascii="Arial" w:hAnsi="Arial" w:eastAsia="Arial"/>
+                <w:b/>
+                <w:i w:val="0"/>
+                <w:color w:val="38761D"/>
+                <w:sz w:val="18"/>
+              </w:rPr>
+              <w:t>SIM HOOK:</w:t>
+            </w:r>
+            <w:r>
+              <w:rPr>
+                <w:rFonts w:ascii="Arial" w:hAnsi="Arial" w:eastAsia="Arial"/>
+                <w:b w:val="0"/>
+                <w:i w:val="0"/>
+                <w:sz w:val="18"/>
+              </w:rPr>
+              <w:t xml:space="preserve"> SimBook – Analytics Everywhere (Industry Map, Skill Builder)</w:t>
+            </w:r>
+          </w:p>
+          <w:p>
+            <w:pPr>
+              <w:tabs>
+                <w:tab w:pos="220" w:val="left"/>
+              </w:tabs>
+              <w:spacing w:before="0" w:after="40" w:line="240" w:lineRule="auto"/>
+              <w:ind w:left="220" w:hanging="220"/>
+            </w:pPr>
+            <w:r>
+              <w:rPr>
+                <w:rFonts w:ascii="Arial" w:hAnsi="Arial" w:eastAsia="Arial"/>
+                <w:b w:val="0"/>
+                <w:i w:val="0"/>
+                <w:sz w:val="18"/>
+              </w:rPr>
+              <w:t>3.</w:t>
+              <w:tab/>
+            </w:r>
+            <w:r>
+              <w:rPr>
+                <w:rFonts w:ascii="Arial" w:hAnsi="Arial" w:eastAsia="Arial"/>
                 <w:b w:val="0"/>
                 <w:i w:val="0"/>
                 <w:sz w:val="18"/>
@@ -5038,7 +5208,7 @@
                 <w:i w:val="0"/>
                 <w:sz w:val="18"/>
               </w:rPr>
-              <w:t>3.</w:t>
+              <w:t>4.</w:t>
               <w:tab/>
             </w:r>
             <w:r>
@@ -5062,6 +5232,34 @@
               <w:end w:w="80" w:type="dxa"/>
             </w:tcMar>
           </w:tcPr>
+          <w:p>
+            <w:pPr>
+              <w:tabs>
+                <w:tab w:pos="220" w:val="left"/>
+              </w:tabs>
+              <w:spacing w:before="0" w:after="40" w:line="240" w:lineRule="auto"/>
+              <w:ind w:left="220" w:hanging="220"/>
+            </w:pPr>
+            <w:r>
+              <w:rPr>
+                <w:rFonts w:ascii="Arial" w:hAnsi="Arial" w:eastAsia="Arial"/>
+                <w:b w:val="0"/>
+                <w:i w:val="0"/>
+                <w:sz w:val="18"/>
+              </w:rPr>
+              <w:t>•</w:t>
+              <w:tab/>
+            </w:r>
+            <w:r>
+              <w:rPr>
+                <w:rFonts w:ascii="Arial" w:hAnsi="Arial" w:eastAsia="Arial"/>
+                <w:b w:val="0"/>
+                <w:i w:val="0"/>
+                <w:sz w:val="18"/>
+              </w:rPr>
+              <w:t>Data Analytics SimBook – Lesson 3 (hook sim, lesson slides with notes, and Exercises)</w:t>
+            </w:r>
+          </w:p>
           <w:p>
             <w:pPr>
               <w:tabs>
@@ -6127,6 +6325,44 @@
             <w:r>
               <w:rPr>
                 <w:rFonts w:ascii="Arial" w:hAnsi="Arial" w:eastAsia="Arial"/>
+                <w:b/>
+                <w:i w:val="0"/>
+                <w:color w:val="38761D"/>
+                <w:sz w:val="18"/>
+              </w:rPr>
+              <w:t>SIM HOOK:</w:t>
+            </w:r>
+            <w:r>
+              <w:rPr>
+                <w:rFonts w:ascii="Arial" w:hAnsi="Arial" w:eastAsia="Arial"/>
+                <w:b w:val="0"/>
+                <w:i w:val="0"/>
+                <w:sz w:val="18"/>
+              </w:rPr>
+              <w:t xml:space="preserve"> SimBook – Collect It Three Ways (Source Sorter, Three Ways, Is It Reliable?)</w:t>
+            </w:r>
+          </w:p>
+          <w:p>
+            <w:pPr>
+              <w:tabs>
+                <w:tab w:pos="220" w:val="left"/>
+              </w:tabs>
+              <w:spacing w:before="0" w:after="40" w:line="240" w:lineRule="auto"/>
+              <w:ind w:left="220" w:hanging="220"/>
+            </w:pPr>
+            <w:r>
+              <w:rPr>
+                <w:rFonts w:ascii="Arial" w:hAnsi="Arial" w:eastAsia="Arial"/>
+                <w:b w:val="0"/>
+                <w:i w:val="0"/>
+                <w:sz w:val="18"/>
+              </w:rPr>
+              <w:t>3.</w:t>
+              <w:tab/>
+            </w:r>
+            <w:r>
+              <w:rPr>
+                <w:rFonts w:ascii="Arial" w:hAnsi="Arial" w:eastAsia="Arial"/>
                 <w:b w:val="0"/>
                 <w:i w:val="0"/>
                 <w:sz w:val="18"/>
@@ -6149,7 +6385,7 @@
                 <w:i w:val="0"/>
                 <w:sz w:val="18"/>
               </w:rPr>
-              <w:t>3.</w:t>
+              <w:t>4.</w:t>
               <w:tab/>
             </w:r>
             <w:r>
@@ -6177,7 +6413,7 @@
                 <w:i w:val="0"/>
                 <w:sz w:val="18"/>
               </w:rPr>
-              <w:t>4.</w:t>
+              <w:t>5.</w:t>
               <w:tab/>
             </w:r>
             <w:r>
@@ -6205,7 +6441,7 @@
                 <w:i w:val="0"/>
                 <w:sz w:val="18"/>
               </w:rPr>
-              <w:t>5.</w:t>
+              <w:t>6.</w:t>
               <w:tab/>
             </w:r>
             <w:r>
@@ -6229,6 +6465,34 @@
               <w:end w:w="80" w:type="dxa"/>
             </w:tcMar>
           </w:tcPr>
+          <w:p>
+            <w:pPr>
+              <w:tabs>
+                <w:tab w:pos="220" w:val="left"/>
+              </w:tabs>
+              <w:spacing w:before="0" w:after="40" w:line="240" w:lineRule="auto"/>
+              <w:ind w:left="220" w:hanging="220"/>
+            </w:pPr>
+            <w:r>
+              <w:rPr>
+                <w:rFonts w:ascii="Arial" w:hAnsi="Arial" w:eastAsia="Arial"/>
+                <w:b w:val="0"/>
+                <w:i w:val="0"/>
+                <w:sz w:val="18"/>
+              </w:rPr>
+              <w:t>•</w:t>
+              <w:tab/>
+            </w:r>
+            <w:r>
+              <w:rPr>
+                <w:rFonts w:ascii="Arial" w:hAnsi="Arial" w:eastAsia="Arial"/>
+                <w:b w:val="0"/>
+                <w:i w:val="0"/>
+                <w:sz w:val="18"/>
+              </w:rPr>
+              <w:t>Data Analytics SimBook – Lesson 4 (hook sim, lesson slides with notes, and Exercises)</w:t>
+            </w:r>
+          </w:p>
           <w:p>
             <w:pPr>
               <w:tabs>
@@ -6853,6 +7117,44 @@
             <w:r>
               <w:rPr>
                 <w:rFonts w:ascii="Arial" w:hAnsi="Arial" w:eastAsia="Arial"/>
+                <w:b/>
+                <w:i w:val="0"/>
+                <w:color w:val="38761D"/>
+                <w:sz w:val="18"/>
+              </w:rPr>
+              <w:t>SIM HOOK:</w:t>
+            </w:r>
+            <w:r>
+              <w:rPr>
+                <w:rFonts w:ascii="Arial" w:hAnsi="Arial" w:eastAsia="Arial"/>
+                <w:b w:val="0"/>
+                <w:i w:val="0"/>
+                <w:sz w:val="18"/>
+              </w:rPr>
+              <w:t xml:space="preserve"> SimBook – First Look (Explore, Version History)</w:t>
+            </w:r>
+          </w:p>
+          <w:p>
+            <w:pPr>
+              <w:tabs>
+                <w:tab w:pos="220" w:val="left"/>
+              </w:tabs>
+              <w:spacing w:before="0" w:after="40" w:line="240" w:lineRule="auto"/>
+              <w:ind w:left="220" w:hanging="220"/>
+            </w:pPr>
+            <w:r>
+              <w:rPr>
+                <w:rFonts w:ascii="Arial" w:hAnsi="Arial" w:eastAsia="Arial"/>
+                <w:b w:val="0"/>
+                <w:i w:val="0"/>
+                <w:sz w:val="18"/>
+              </w:rPr>
+              <w:t>3.</w:t>
+              <w:tab/>
+            </w:r>
+            <w:r>
+              <w:rPr>
+                <w:rFonts w:ascii="Arial" w:hAnsi="Arial" w:eastAsia="Arial"/>
                 <w:b w:val="0"/>
                 <w:i w:val="0"/>
                 <w:sz w:val="18"/>
@@ -6875,7 +7177,7 @@
                 <w:i w:val="0"/>
                 <w:sz w:val="18"/>
               </w:rPr>
-              <w:t>3.</w:t>
+              <w:t>4.</w:t>
               <w:tab/>
             </w:r>
             <w:r>
@@ -6903,7 +7205,7 @@
                 <w:i w:val="0"/>
                 <w:sz w:val="18"/>
               </w:rPr>
-              <w:t>4.</w:t>
+              <w:t>5.</w:t>
               <w:tab/>
             </w:r>
             <w:r>
@@ -6927,6 +7229,34 @@
               <w:end w:w="80" w:type="dxa"/>
             </w:tcMar>
           </w:tcPr>
+          <w:p>
+            <w:pPr>
+              <w:tabs>
+                <w:tab w:pos="220" w:val="left"/>
+              </w:tabs>
+              <w:spacing w:before="0" w:after="40" w:line="240" w:lineRule="auto"/>
+              <w:ind w:left="220" w:hanging="220"/>
+            </w:pPr>
+            <w:r>
+              <w:rPr>
+                <w:rFonts w:ascii="Arial" w:hAnsi="Arial" w:eastAsia="Arial"/>
+                <w:b w:val="0"/>
+                <w:i w:val="0"/>
+                <w:sz w:val="18"/>
+              </w:rPr>
+              <w:t>•</w:t>
+              <w:tab/>
+            </w:r>
+            <w:r>
+              <w:rPr>
+                <w:rFonts w:ascii="Arial" w:hAnsi="Arial" w:eastAsia="Arial"/>
+                <w:b w:val="0"/>
+                <w:i w:val="0"/>
+                <w:sz w:val="18"/>
+              </w:rPr>
+              <w:t>Data Analytics SimBook – Lesson 5 (hook sim, lesson slides with notes, and Exercises)</w:t>
+            </w:r>
+          </w:p>
           <w:p>
             <w:pPr>
               <w:tabs>
@@ -8504,6 +8834,44 @@
             <w:r>
               <w:rPr>
                 <w:rFonts w:ascii="Arial" w:hAnsi="Arial" w:eastAsia="Arial"/>
+                <w:b/>
+                <w:i w:val="0"/>
+                <w:color w:val="38761D"/>
+                <w:sz w:val="18"/>
+              </w:rPr>
+              <w:t>SIM HOOK:</w:t>
+            </w:r>
+            <w:r>
+              <w:rPr>
+                <w:rFonts w:ascii="Arial" w:hAnsi="Arial" w:eastAsia="Arial"/>
+                <w:b w:val="0"/>
+                <w:i w:val="0"/>
+                <w:sz w:val="18"/>
+              </w:rPr>
+              <w:t xml:space="preserve"> SimBook – Data Cleaner (Spot the Problems, Clean It, Before / After)</w:t>
+            </w:r>
+          </w:p>
+          <w:p>
+            <w:pPr>
+              <w:tabs>
+                <w:tab w:pos="220" w:val="left"/>
+              </w:tabs>
+              <w:spacing w:before="0" w:after="40" w:line="240" w:lineRule="auto"/>
+              <w:ind w:left="220" w:hanging="220"/>
+            </w:pPr>
+            <w:r>
+              <w:rPr>
+                <w:rFonts w:ascii="Arial" w:hAnsi="Arial" w:eastAsia="Arial"/>
+                <w:b w:val="0"/>
+                <w:i w:val="0"/>
+                <w:sz w:val="18"/>
+              </w:rPr>
+              <w:t>3.</w:t>
+              <w:tab/>
+            </w:r>
+            <w:r>
+              <w:rPr>
+                <w:rFonts w:ascii="Arial" w:hAnsi="Arial" w:eastAsia="Arial"/>
                 <w:b w:val="0"/>
                 <w:i w:val="0"/>
                 <w:sz w:val="18"/>
@@ -8526,7 +8894,7 @@
                 <w:i w:val="0"/>
                 <w:sz w:val="18"/>
               </w:rPr>
-              <w:t>3.</w:t>
+              <w:t>4.</w:t>
               <w:tab/>
             </w:r>
             <w:r>
@@ -8550,6 +8918,34 @@
               <w:end w:w="80" w:type="dxa"/>
             </w:tcMar>
           </w:tcPr>
+          <w:p>
+            <w:pPr>
+              <w:tabs>
+                <w:tab w:pos="220" w:val="left"/>
+              </w:tabs>
+              <w:spacing w:before="0" w:after="40" w:line="240" w:lineRule="auto"/>
+              <w:ind w:left="220" w:hanging="220"/>
+            </w:pPr>
+            <w:r>
+              <w:rPr>
+                <w:rFonts w:ascii="Arial" w:hAnsi="Arial" w:eastAsia="Arial"/>
+                <w:b w:val="0"/>
+                <w:i w:val="0"/>
+                <w:sz w:val="18"/>
+              </w:rPr>
+              <w:t>•</w:t>
+              <w:tab/>
+            </w:r>
+            <w:r>
+              <w:rPr>
+                <w:rFonts w:ascii="Arial" w:hAnsi="Arial" w:eastAsia="Arial"/>
+                <w:b w:val="0"/>
+                <w:i w:val="0"/>
+                <w:sz w:val="18"/>
+              </w:rPr>
+              <w:t>Data Analytics SimBook – Lesson 6 (hook sim, lesson slides with notes, and Exercises)</w:t>
+            </w:r>
+          </w:p>
           <w:p>
             <w:pPr>
               <w:tabs>
@@ -9230,6 +9626,44 @@
             <w:r>
               <w:rPr>
                 <w:rFonts w:ascii="Arial" w:hAnsi="Arial" w:eastAsia="Arial"/>
+                <w:b/>
+                <w:i w:val="0"/>
+                <w:color w:val="38761D"/>
+                <w:sz w:val="18"/>
+              </w:rPr>
+              <w:t>SIM HOOK:</w:t>
+            </w:r>
+            <w:r>
+              <w:rPr>
+                <w:rFonts w:ascii="Arial" w:hAnsi="Arial" w:eastAsia="Arial"/>
+                <w:b w:val="0"/>
+                <w:i w:val="0"/>
+                <w:sz w:val="18"/>
+              </w:rPr>
+              <w:t xml:space="preserve"> SimBook – Formula Lab (Conditional, Lookup, Combine)</w:t>
+            </w:r>
+          </w:p>
+          <w:p>
+            <w:pPr>
+              <w:tabs>
+                <w:tab w:pos="220" w:val="left"/>
+              </w:tabs>
+              <w:spacing w:before="0" w:after="40" w:line="240" w:lineRule="auto"/>
+              <w:ind w:left="220" w:hanging="220"/>
+            </w:pPr>
+            <w:r>
+              <w:rPr>
+                <w:rFonts w:ascii="Arial" w:hAnsi="Arial" w:eastAsia="Arial"/>
+                <w:b w:val="0"/>
+                <w:i w:val="0"/>
+                <w:sz w:val="18"/>
+              </w:rPr>
+              <w:t>3.</w:t>
+              <w:tab/>
+            </w:r>
+            <w:r>
+              <w:rPr>
+                <w:rFonts w:ascii="Arial" w:hAnsi="Arial" w:eastAsia="Arial"/>
                 <w:b w:val="0"/>
                 <w:i w:val="0"/>
                 <w:sz w:val="18"/>
@@ -9252,7 +9686,7 @@
                 <w:i w:val="0"/>
                 <w:sz w:val="18"/>
               </w:rPr>
-              <w:t>3.</w:t>
+              <w:t>4.</w:t>
               <w:tab/>
             </w:r>
             <w:r>
@@ -9280,7 +9714,7 @@
                 <w:i w:val="0"/>
                 <w:sz w:val="18"/>
               </w:rPr>
-              <w:t>4.</w:t>
+              <w:t>5.</w:t>
               <w:tab/>
             </w:r>
             <w:r>
@@ -9304,6 +9738,34 @@
               <w:end w:w="80" w:type="dxa"/>
             </w:tcMar>
           </w:tcPr>
+          <w:p>
+            <w:pPr>
+              <w:tabs>
+                <w:tab w:pos="220" w:val="left"/>
+              </w:tabs>
+              <w:spacing w:before="0" w:after="40" w:line="240" w:lineRule="auto"/>
+              <w:ind w:left="220" w:hanging="220"/>
+            </w:pPr>
+            <w:r>
+              <w:rPr>
+                <w:rFonts w:ascii="Arial" w:hAnsi="Arial" w:eastAsia="Arial"/>
+                <w:b w:val="0"/>
+                <w:i w:val="0"/>
+                <w:sz w:val="18"/>
+              </w:rPr>
+              <w:t>•</w:t>
+              <w:tab/>
+            </w:r>
+            <w:r>
+              <w:rPr>
+                <w:rFonts w:ascii="Arial" w:hAnsi="Arial" w:eastAsia="Arial"/>
+                <w:b w:val="0"/>
+                <w:i w:val="0"/>
+                <w:sz w:val="18"/>
+              </w:rPr>
+              <w:t>Data Analytics SimBook – Lesson 7 (hook sim, lesson slides with notes, and Exercises)</w:t>
+            </w:r>
+          </w:p>
           <w:p>
             <w:pPr>
               <w:tabs>
@@ -9900,6 +10362,44 @@
             <w:r>
               <w:rPr>
                 <w:rFonts w:ascii="Arial" w:hAnsi="Arial" w:eastAsia="Arial"/>
+                <w:b/>
+                <w:i w:val="0"/>
+                <w:color w:val="38761D"/>
+                <w:sz w:val="18"/>
+              </w:rPr>
+              <w:t>SIM HOOK:</w:t>
+            </w:r>
+            <w:r>
+              <w:rPr>
+                <w:rFonts w:ascii="Arial" w:hAnsi="Arial" w:eastAsia="Arial"/>
+                <w:b w:val="0"/>
+                <w:i w:val="0"/>
+                <w:sz w:val="18"/>
+              </w:rPr>
+              <w:t xml:space="preserve"> SimBook – Pivot Builder</w:t>
+            </w:r>
+          </w:p>
+          <w:p>
+            <w:pPr>
+              <w:tabs>
+                <w:tab w:pos="220" w:val="left"/>
+              </w:tabs>
+              <w:spacing w:before="0" w:after="40" w:line="240" w:lineRule="auto"/>
+              <w:ind w:left="220" w:hanging="220"/>
+            </w:pPr>
+            <w:r>
+              <w:rPr>
+                <w:rFonts w:ascii="Arial" w:hAnsi="Arial" w:eastAsia="Arial"/>
+                <w:b w:val="0"/>
+                <w:i w:val="0"/>
+                <w:sz w:val="18"/>
+              </w:rPr>
+              <w:t>3.</w:t>
+              <w:tab/>
+            </w:r>
+            <w:r>
+              <w:rPr>
+                <w:rFonts w:ascii="Arial" w:hAnsi="Arial" w:eastAsia="Arial"/>
                 <w:b w:val="0"/>
                 <w:i w:val="0"/>
                 <w:sz w:val="18"/>
@@ -9922,7 +10422,7 @@
                 <w:i w:val="0"/>
                 <w:sz w:val="18"/>
               </w:rPr>
-              <w:t>3.</w:t>
+              <w:t>4.</w:t>
               <w:tab/>
             </w:r>
             <w:r>
@@ -9946,6 +10446,34 @@
               <w:end w:w="80" w:type="dxa"/>
             </w:tcMar>
           </w:tcPr>
+          <w:p>
+            <w:pPr>
+              <w:tabs>
+                <w:tab w:pos="220" w:val="left"/>
+              </w:tabs>
+              <w:spacing w:before="0" w:after="40" w:line="240" w:lineRule="auto"/>
+              <w:ind w:left="220" w:hanging="220"/>
+            </w:pPr>
+            <w:r>
+              <w:rPr>
+                <w:rFonts w:ascii="Arial" w:hAnsi="Arial" w:eastAsia="Arial"/>
+                <w:b w:val="0"/>
+                <w:i w:val="0"/>
+                <w:sz w:val="18"/>
+              </w:rPr>
+              <w:t>•</w:t>
+              <w:tab/>
+            </w:r>
+            <w:r>
+              <w:rPr>
+                <w:rFonts w:ascii="Arial" w:hAnsi="Arial" w:eastAsia="Arial"/>
+                <w:b w:val="0"/>
+                <w:i w:val="0"/>
+                <w:sz w:val="18"/>
+              </w:rPr>
+              <w:t>Data Analytics SimBook – Lesson 8 (hook sim, lesson slides with notes, and Exercises)</w:t>
+            </w:r>
+          </w:p>
           <w:p>
             <w:pPr>
               <w:tabs>
@@ -11438,6 +11966,44 @@
             <w:r>
               <w:rPr>
                 <w:rFonts w:ascii="Arial" w:hAnsi="Arial" w:eastAsia="Arial"/>
+                <w:b/>
+                <w:i w:val="0"/>
+                <w:color w:val="38761D"/>
+                <w:sz w:val="18"/>
+              </w:rPr>
+              <w:t>SIM HOOK:</w:t>
+            </w:r>
+            <w:r>
+              <w:rPr>
+                <w:rFonts w:ascii="Arial" w:hAnsi="Arial" w:eastAsia="Arial"/>
+                <w:b w:val="0"/>
+                <w:i w:val="0"/>
+                <w:sz w:val="18"/>
+              </w:rPr>
+              <w:t xml:space="preserve"> SimBook – Spread Lab (Drag the Data, Box and Quartiles, Formulas)</w:t>
+            </w:r>
+          </w:p>
+          <w:p>
+            <w:pPr>
+              <w:tabs>
+                <w:tab w:pos="220" w:val="left"/>
+              </w:tabs>
+              <w:spacing w:before="0" w:after="40" w:line="240" w:lineRule="auto"/>
+              <w:ind w:left="220" w:hanging="220"/>
+            </w:pPr>
+            <w:r>
+              <w:rPr>
+                <w:rFonts w:ascii="Arial" w:hAnsi="Arial" w:eastAsia="Arial"/>
+                <w:b w:val="0"/>
+                <w:i w:val="0"/>
+                <w:sz w:val="18"/>
+              </w:rPr>
+              <w:t>3.</w:t>
+              <w:tab/>
+            </w:r>
+            <w:r>
+              <w:rPr>
+                <w:rFonts w:ascii="Arial" w:hAnsi="Arial" w:eastAsia="Arial"/>
                 <w:b w:val="0"/>
                 <w:i w:val="0"/>
                 <w:sz w:val="18"/>
@@ -11460,7 +12026,7 @@
                 <w:i w:val="0"/>
                 <w:sz w:val="18"/>
               </w:rPr>
-              <w:t>3.</w:t>
+              <w:t>4.</w:t>
               <w:tab/>
             </w:r>
             <w:r>
@@ -11488,7 +12054,7 @@
                 <w:i w:val="0"/>
                 <w:sz w:val="18"/>
               </w:rPr>
-              <w:t>4.</w:t>
+              <w:t>5.</w:t>
               <w:tab/>
             </w:r>
             <w:r>
@@ -11512,6 +12078,34 @@
               <w:end w:w="80" w:type="dxa"/>
             </w:tcMar>
           </w:tcPr>
+          <w:p>
+            <w:pPr>
+              <w:tabs>
+                <w:tab w:pos="220" w:val="left"/>
+              </w:tabs>
+              <w:spacing w:before="0" w:after="40" w:line="240" w:lineRule="auto"/>
+              <w:ind w:left="220" w:hanging="220"/>
+            </w:pPr>
+            <w:r>
+              <w:rPr>
+                <w:rFonts w:ascii="Arial" w:hAnsi="Arial" w:eastAsia="Arial"/>
+                <w:b w:val="0"/>
+                <w:i w:val="0"/>
+                <w:sz w:val="18"/>
+              </w:rPr>
+              <w:t>•</w:t>
+              <w:tab/>
+            </w:r>
+            <w:r>
+              <w:rPr>
+                <w:rFonts w:ascii="Arial" w:hAnsi="Arial" w:eastAsia="Arial"/>
+                <w:b w:val="0"/>
+                <w:i w:val="0"/>
+                <w:sz w:val="18"/>
+              </w:rPr>
+              <w:t>Data Analytics SimBook – Lesson 9 (hook sim, lesson slides with notes, and Exercises)</w:t>
+            </w:r>
+          </w:p>
           <w:p>
             <w:pPr>
               <w:tabs>
@@ -12116,6 +12710,44 @@
             <w:r>
               <w:rPr>
                 <w:rFonts w:ascii="Arial" w:hAnsi="Arial" w:eastAsia="Arial"/>
+                <w:b/>
+                <w:i w:val="0"/>
+                <w:color w:val="38761D"/>
+                <w:sz w:val="18"/>
+              </w:rPr>
+              <w:t>SIM HOOK:</w:t>
+            </w:r>
+            <w:r>
+              <w:rPr>
+                <w:rFonts w:ascii="Arial" w:hAnsi="Arial" w:eastAsia="Arial"/>
+                <w:b w:val="0"/>
+                <w:i w:val="0"/>
+                <w:sz w:val="18"/>
+              </w:rPr>
+              <w:t xml:space="preserve"> SimBook – Test Lab (Two Groups, z-test, Correlation and Regression)</w:t>
+            </w:r>
+          </w:p>
+          <w:p>
+            <w:pPr>
+              <w:tabs>
+                <w:tab w:pos="220" w:val="left"/>
+              </w:tabs>
+              <w:spacing w:before="0" w:after="40" w:line="240" w:lineRule="auto"/>
+              <w:ind w:left="220" w:hanging="220"/>
+            </w:pPr>
+            <w:r>
+              <w:rPr>
+                <w:rFonts w:ascii="Arial" w:hAnsi="Arial" w:eastAsia="Arial"/>
+                <w:b w:val="0"/>
+                <w:i w:val="0"/>
+                <w:sz w:val="18"/>
+              </w:rPr>
+              <w:t>3.</w:t>
+              <w:tab/>
+            </w:r>
+            <w:r>
+              <w:rPr>
+                <w:rFonts w:ascii="Arial" w:hAnsi="Arial" w:eastAsia="Arial"/>
                 <w:b w:val="0"/>
                 <w:i w:val="0"/>
                 <w:sz w:val="18"/>
@@ -12138,7 +12770,7 @@
                 <w:i w:val="0"/>
                 <w:sz w:val="18"/>
               </w:rPr>
-              <w:t>3.</w:t>
+              <w:t>4.</w:t>
               <w:tab/>
             </w:r>
             <w:r>
@@ -12166,7 +12798,7 @@
                 <w:i w:val="0"/>
                 <w:sz w:val="18"/>
               </w:rPr>
-              <w:t>4.</w:t>
+              <w:t>5.</w:t>
               <w:tab/>
             </w:r>
             <w:r>
@@ -12190,6 +12822,34 @@
               <w:end w:w="80" w:type="dxa"/>
             </w:tcMar>
           </w:tcPr>
+          <w:p>
+            <w:pPr>
+              <w:tabs>
+                <w:tab w:pos="220" w:val="left"/>
+              </w:tabs>
+              <w:spacing w:before="0" w:after="40" w:line="240" w:lineRule="auto"/>
+              <w:ind w:left="220" w:hanging="220"/>
+            </w:pPr>
+            <w:r>
+              <w:rPr>
+                <w:rFonts w:ascii="Arial" w:hAnsi="Arial" w:eastAsia="Arial"/>
+                <w:b w:val="0"/>
+                <w:i w:val="0"/>
+                <w:sz w:val="18"/>
+              </w:rPr>
+              <w:t>•</w:t>
+              <w:tab/>
+            </w:r>
+            <w:r>
+              <w:rPr>
+                <w:rFonts w:ascii="Arial" w:hAnsi="Arial" w:eastAsia="Arial"/>
+                <w:b w:val="0"/>
+                <w:i w:val="0"/>
+                <w:sz w:val="18"/>
+              </w:rPr>
+              <w:t>Data Analytics SimBook – Lesson 10 (hook sim, lesson slides with notes, and Exercises)</w:t>
+            </w:r>
+          </w:p>
           <w:p>
             <w:pPr>
               <w:tabs>
@@ -13702,6 +14362,44 @@
             <w:r>
               <w:rPr>
                 <w:rFonts w:ascii="Arial" w:hAnsi="Arial" w:eastAsia="Arial"/>
+                <w:b/>
+                <w:i w:val="0"/>
+                <w:color w:val="38761D"/>
+                <w:sz w:val="18"/>
+              </w:rPr>
+              <w:t>SIM HOOK:</w:t>
+            </w:r>
+            <w:r>
+              <w:rPr>
+                <w:rFonts w:ascii="Arial" w:hAnsi="Arial" w:eastAsia="Arial"/>
+                <w:b w:val="0"/>
+                <w:i w:val="0"/>
+                <w:sz w:val="18"/>
+              </w:rPr>
+              <w:t xml:space="preserve"> SimBook – Chart Chooser (Chart Types, Format It, Honest or Misleading?, Slicers)</w:t>
+            </w:r>
+          </w:p>
+          <w:p>
+            <w:pPr>
+              <w:tabs>
+                <w:tab w:pos="220" w:val="left"/>
+              </w:tabs>
+              <w:spacing w:before="0" w:after="40" w:line="240" w:lineRule="auto"/>
+              <w:ind w:left="220" w:hanging="220"/>
+            </w:pPr>
+            <w:r>
+              <w:rPr>
+                <w:rFonts w:ascii="Arial" w:hAnsi="Arial" w:eastAsia="Arial"/>
+                <w:b w:val="0"/>
+                <w:i w:val="0"/>
+                <w:sz w:val="18"/>
+              </w:rPr>
+              <w:t>3.</w:t>
+              <w:tab/>
+            </w:r>
+            <w:r>
+              <w:rPr>
+                <w:rFonts w:ascii="Arial" w:hAnsi="Arial" w:eastAsia="Arial"/>
                 <w:b w:val="0"/>
                 <w:i w:val="0"/>
                 <w:sz w:val="18"/>
@@ -13724,7 +14422,7 @@
                 <w:i w:val="0"/>
                 <w:sz w:val="18"/>
               </w:rPr>
-              <w:t>3.</w:t>
+              <w:t>4.</w:t>
               <w:tab/>
             </w:r>
             <w:r>
@@ -13752,7 +14450,7 @@
                 <w:i w:val="0"/>
                 <w:sz w:val="18"/>
               </w:rPr>
-              <w:t>4.</w:t>
+              <w:t>5.</w:t>
               <w:tab/>
             </w:r>
             <w:r>
@@ -13776,6 +14474,34 @@
               <w:end w:w="80" w:type="dxa"/>
             </w:tcMar>
           </w:tcPr>
+          <w:p>
+            <w:pPr>
+              <w:tabs>
+                <w:tab w:pos="220" w:val="left"/>
+              </w:tabs>
+              <w:spacing w:before="0" w:after="40" w:line="240" w:lineRule="auto"/>
+              <w:ind w:left="220" w:hanging="220"/>
+            </w:pPr>
+            <w:r>
+              <w:rPr>
+                <w:rFonts w:ascii="Arial" w:hAnsi="Arial" w:eastAsia="Arial"/>
+                <w:b w:val="0"/>
+                <w:i w:val="0"/>
+                <w:sz w:val="18"/>
+              </w:rPr>
+              <w:t>•</w:t>
+              <w:tab/>
+            </w:r>
+            <w:r>
+              <w:rPr>
+                <w:rFonts w:ascii="Arial" w:hAnsi="Arial" w:eastAsia="Arial"/>
+                <w:b w:val="0"/>
+                <w:i w:val="0"/>
+                <w:sz w:val="18"/>
+              </w:rPr>
+              <w:t>Data Analytics SimBook – Lesson 11 (hook sim, lesson slides with notes, and Exercises)</w:t>
+            </w:r>
+          </w:p>
           <w:p>
             <w:pPr>
               <w:tabs>
@@ -14419,6 +15145,44 @@
             <w:r>
               <w:rPr>
                 <w:rFonts w:ascii="Arial" w:hAnsi="Arial" w:eastAsia="Arial"/>
+                <w:b/>
+                <w:i w:val="0"/>
+                <w:color w:val="38761D"/>
+                <w:sz w:val="18"/>
+              </w:rPr>
+              <w:t>SIM HOOK:</w:t>
+            </w:r>
+            <w:r>
+              <w:rPr>
+                <w:rFonts w:ascii="Arial" w:hAnsi="Arial" w:eastAsia="Arial"/>
+                <w:b w:val="0"/>
+                <w:i w:val="0"/>
+                <w:sz w:val="18"/>
+              </w:rPr>
+              <w:t xml:space="preserve"> SimBook – Dashboard Builder (Build, Explore, Choose the Visual)</w:t>
+            </w:r>
+          </w:p>
+          <w:p>
+            <w:pPr>
+              <w:tabs>
+                <w:tab w:pos="220" w:val="left"/>
+              </w:tabs>
+              <w:spacing w:before="0" w:after="40" w:line="240" w:lineRule="auto"/>
+              <w:ind w:left="220" w:hanging="220"/>
+            </w:pPr>
+            <w:r>
+              <w:rPr>
+                <w:rFonts w:ascii="Arial" w:hAnsi="Arial" w:eastAsia="Arial"/>
+                <w:b w:val="0"/>
+                <w:i w:val="0"/>
+                <w:sz w:val="18"/>
+              </w:rPr>
+              <w:t>3.</w:t>
+              <w:tab/>
+            </w:r>
+            <w:r>
+              <w:rPr>
+                <w:rFonts w:ascii="Arial" w:hAnsi="Arial" w:eastAsia="Arial"/>
                 <w:b w:val="0"/>
                 <w:i w:val="0"/>
                 <w:sz w:val="18"/>
@@ -14441,7 +15205,7 @@
                 <w:i w:val="0"/>
                 <w:sz w:val="18"/>
               </w:rPr>
-              <w:t>3.</w:t>
+              <w:t>4.</w:t>
               <w:tab/>
             </w:r>
             <w:r>
@@ -14465,6 +15229,34 @@
               <w:end w:w="80" w:type="dxa"/>
             </w:tcMar>
           </w:tcPr>
+          <w:p>
+            <w:pPr>
+              <w:tabs>
+                <w:tab w:pos="220" w:val="left"/>
+              </w:tabs>
+              <w:spacing w:before="0" w:after="40" w:line="240" w:lineRule="auto"/>
+              <w:ind w:left="220" w:hanging="220"/>
+            </w:pPr>
+            <w:r>
+              <w:rPr>
+                <w:rFonts w:ascii="Arial" w:hAnsi="Arial" w:eastAsia="Arial"/>
+                <w:b w:val="0"/>
+                <w:i w:val="0"/>
+                <w:sz w:val="18"/>
+              </w:rPr>
+              <w:t>•</w:t>
+              <w:tab/>
+            </w:r>
+            <w:r>
+              <w:rPr>
+                <w:rFonts w:ascii="Arial" w:hAnsi="Arial" w:eastAsia="Arial"/>
+                <w:b w:val="0"/>
+                <w:i w:val="0"/>
+                <w:sz w:val="18"/>
+              </w:rPr>
+              <w:t>Data Analytics SimBook – Lesson 12 (hook sim, lesson slides with notes, and Exercises)</w:t>
+            </w:r>
+          </w:p>
           <w:p>
             <w:pPr>
               <w:tabs>
@@ -15032,6 +15824,44 @@
             <w:r>
               <w:rPr>
                 <w:rFonts w:ascii="Arial" w:hAnsi="Arial" w:eastAsia="Arial"/>
+                <w:b/>
+                <w:i w:val="0"/>
+                <w:color w:val="38761D"/>
+                <w:sz w:val="18"/>
+              </w:rPr>
+              <w:t>SIM HOOK:</w:t>
+            </w:r>
+            <w:r>
+              <w:rPr>
+                <w:rFonts w:ascii="Arial" w:hAnsi="Arial" w:eastAsia="Arial"/>
+                <w:b w:val="0"/>
+                <w:i w:val="0"/>
+                <w:sz w:val="18"/>
+              </w:rPr>
+              <w:t xml:space="preserve"> SimBook – Story Builder (Story Arc, Emphasis, Know Your Audience)</w:t>
+            </w:r>
+          </w:p>
+          <w:p>
+            <w:pPr>
+              <w:tabs>
+                <w:tab w:pos="220" w:val="left"/>
+              </w:tabs>
+              <w:spacing w:before="0" w:after="40" w:line="240" w:lineRule="auto"/>
+              <w:ind w:left="220" w:hanging="220"/>
+            </w:pPr>
+            <w:r>
+              <w:rPr>
+                <w:rFonts w:ascii="Arial" w:hAnsi="Arial" w:eastAsia="Arial"/>
+                <w:b w:val="0"/>
+                <w:i w:val="0"/>
+                <w:sz w:val="18"/>
+              </w:rPr>
+              <w:t>3.</w:t>
+              <w:tab/>
+            </w:r>
+            <w:r>
+              <w:rPr>
+                <w:rFonts w:ascii="Arial" w:hAnsi="Arial" w:eastAsia="Arial"/>
                 <w:b w:val="0"/>
                 <w:i w:val="0"/>
                 <w:sz w:val="18"/>
@@ -15054,7 +15884,7 @@
                 <w:i w:val="0"/>
                 <w:sz w:val="18"/>
               </w:rPr>
-              <w:t>3.</w:t>
+              <w:t>4.</w:t>
               <w:tab/>
             </w:r>
             <w:r>
@@ -15078,6 +15908,34 @@
               <w:end w:w="80" w:type="dxa"/>
             </w:tcMar>
           </w:tcPr>
+          <w:p>
+            <w:pPr>
+              <w:tabs>
+                <w:tab w:pos="220" w:val="left"/>
+              </w:tabs>
+              <w:spacing w:before="0" w:after="40" w:line="240" w:lineRule="auto"/>
+              <w:ind w:left="220" w:hanging="220"/>
+            </w:pPr>
+            <w:r>
+              <w:rPr>
+                <w:rFonts w:ascii="Arial" w:hAnsi="Arial" w:eastAsia="Arial"/>
+                <w:b w:val="0"/>
+                <w:i w:val="0"/>
+                <w:sz w:val="18"/>
+              </w:rPr>
+              <w:t>•</w:t>
+              <w:tab/>
+            </w:r>
+            <w:r>
+              <w:rPr>
+                <w:rFonts w:ascii="Arial" w:hAnsi="Arial" w:eastAsia="Arial"/>
+                <w:b w:val="0"/>
+                <w:i w:val="0"/>
+                <w:sz w:val="18"/>
+              </w:rPr>
+              <w:t>Data Analytics SimBook – Lesson 13 (hook sim, lesson slides with notes, and Exercises)</w:t>
+            </w:r>
+          </w:p>
           <w:p>
             <w:pPr>
               <w:tabs>
@@ -16027,6 +16885,44 @@
             <w:r>
               <w:rPr>
                 <w:rFonts w:ascii="Arial" w:hAnsi="Arial" w:eastAsia="Arial"/>
+                <w:b/>
+                <w:i w:val="0"/>
+                <w:color w:val="38761D"/>
+                <w:sz w:val="18"/>
+              </w:rPr>
+              <w:t>SIM HOOK:</w:t>
+            </w:r>
+            <w:r>
+              <w:rPr>
+                <w:rFonts w:ascii="Arial" w:hAnsi="Arial" w:eastAsia="Arial"/>
+                <w:b w:val="0"/>
+                <w:i w:val="0"/>
+                <w:sz w:val="18"/>
+              </w:rPr>
+              <w:t xml:space="preserve"> SimBook – Project Pipeline (Workflow, Reproducibility Check)</w:t>
+            </w:r>
+          </w:p>
+          <w:p>
+            <w:pPr>
+              <w:tabs>
+                <w:tab w:pos="220" w:val="left"/>
+              </w:tabs>
+              <w:spacing w:before="0" w:after="40" w:line="240" w:lineRule="auto"/>
+              <w:ind w:left="220" w:hanging="220"/>
+            </w:pPr>
+            <w:r>
+              <w:rPr>
+                <w:rFonts w:ascii="Arial" w:hAnsi="Arial" w:eastAsia="Arial"/>
+                <w:b w:val="0"/>
+                <w:i w:val="0"/>
+                <w:sz w:val="18"/>
+              </w:rPr>
+              <w:t>3.</w:t>
+              <w:tab/>
+            </w:r>
+            <w:r>
+              <w:rPr>
+                <w:rFonts w:ascii="Arial" w:hAnsi="Arial" w:eastAsia="Arial"/>
                 <w:b w:val="0"/>
                 <w:i w:val="0"/>
                 <w:sz w:val="18"/>
@@ -16049,7 +16945,7 @@
                 <w:i w:val="0"/>
                 <w:sz w:val="18"/>
               </w:rPr>
-              <w:t>3.</w:t>
+              <w:t>4.</w:t>
               <w:tab/>
             </w:r>
             <w:r>
@@ -16074,6 +16970,34 @@
             </w:tcMar>
             <w:shd w:val="clear" w:color="auto" w:fill="D0E0E3"/>
           </w:tcPr>
+          <w:p>
+            <w:pPr>
+              <w:tabs>
+                <w:tab w:pos="220" w:val="left"/>
+              </w:tabs>
+              <w:spacing w:before="0" w:after="40" w:line="240" w:lineRule="auto"/>
+              <w:ind w:left="220" w:hanging="220"/>
+            </w:pPr>
+            <w:r>
+              <w:rPr>
+                <w:rFonts w:ascii="Arial" w:hAnsi="Arial" w:eastAsia="Arial"/>
+                <w:b w:val="0"/>
+                <w:i w:val="0"/>
+                <w:sz w:val="18"/>
+              </w:rPr>
+              <w:t>•</w:t>
+              <w:tab/>
+            </w:r>
+            <w:r>
+              <w:rPr>
+                <w:rFonts w:ascii="Arial" w:hAnsi="Arial" w:eastAsia="Arial"/>
+                <w:b w:val="0"/>
+                <w:i w:val="0"/>
+                <w:sz w:val="18"/>
+              </w:rPr>
+              <w:t>Data Analytics SimBook – Lesson 14 (hook sim, lesson slides with notes, and Exercises)</w:t>
+            </w:r>
+          </w:p>
           <w:p>
             <w:pPr>
               <w:tabs>
@@ -16610,6 +17534,44 @@
             <w:r>
               <w:rPr>
                 <w:rFonts w:ascii="Arial" w:hAnsi="Arial" w:eastAsia="Arial"/>
+                <w:b/>
+                <w:i w:val="0"/>
+                <w:color w:val="38761D"/>
+                <w:sz w:val="18"/>
+              </w:rPr>
+              <w:t>SIM HOOK:</w:t>
+            </w:r>
+            <w:r>
+              <w:rPr>
+                <w:rFonts w:ascii="Arial" w:hAnsi="Arial" w:eastAsia="Arial"/>
+                <w:b w:val="0"/>
+                <w:i w:val="0"/>
+                <w:sz w:val="18"/>
+              </w:rPr>
+              <w:t xml:space="preserve"> SimBook – Verify It (Find the Issues, Write the Critique, Respond)</w:t>
+            </w:r>
+          </w:p>
+          <w:p>
+            <w:pPr>
+              <w:tabs>
+                <w:tab w:pos="220" w:val="left"/>
+              </w:tabs>
+              <w:spacing w:before="0" w:after="40" w:line="240" w:lineRule="auto"/>
+              <w:ind w:left="220" w:hanging="220"/>
+            </w:pPr>
+            <w:r>
+              <w:rPr>
+                <w:rFonts w:ascii="Arial" w:hAnsi="Arial" w:eastAsia="Arial"/>
+                <w:b w:val="0"/>
+                <w:i w:val="0"/>
+                <w:sz w:val="18"/>
+              </w:rPr>
+              <w:t>3.</w:t>
+              <w:tab/>
+            </w:r>
+            <w:r>
+              <w:rPr>
+                <w:rFonts w:ascii="Arial" w:hAnsi="Arial" w:eastAsia="Arial"/>
                 <w:b w:val="0"/>
                 <w:i w:val="0"/>
                 <w:sz w:val="18"/>
@@ -16632,7 +17594,7 @@
                 <w:i w:val="0"/>
                 <w:sz w:val="18"/>
               </w:rPr>
-              <w:t>3.</w:t>
+              <w:t>4.</w:t>
               <w:tab/>
             </w:r>
             <w:r>
@@ -16657,6 +17619,34 @@
             </w:tcMar>
             <w:shd w:val="clear" w:color="auto" w:fill="D0E0E3"/>
           </w:tcPr>
+          <w:p>
+            <w:pPr>
+              <w:tabs>
+                <w:tab w:pos="220" w:val="left"/>
+              </w:tabs>
+              <w:spacing w:before="0" w:after="40" w:line="240" w:lineRule="auto"/>
+              <w:ind w:left="220" w:hanging="220"/>
+            </w:pPr>
+            <w:r>
+              <w:rPr>
+                <w:rFonts w:ascii="Arial" w:hAnsi="Arial" w:eastAsia="Arial"/>
+                <w:b w:val="0"/>
+                <w:i w:val="0"/>
+                <w:sz w:val="18"/>
+              </w:rPr>
+              <w:t>•</w:t>
+              <w:tab/>
+            </w:r>
+            <w:r>
+              <w:rPr>
+                <w:rFonts w:ascii="Arial" w:hAnsi="Arial" w:eastAsia="Arial"/>
+                <w:b w:val="0"/>
+                <w:i w:val="0"/>
+                <w:sz w:val="18"/>
+              </w:rPr>
+              <w:t>Data Analytics SimBook – Lesson 15 (hook sim, lesson slides with notes, and Exercises)</w:t>
+            </w:r>
+          </w:p>
           <w:p>
             <w:pPr>
               <w:tabs>

</xml_diff>

<commit_message>
Data Analytics: number lessons 1-15 instead of lettering them A-O
The SimBook showed two labels per lesson ("Lesson 1 · A"); lessons are
now numbered only, in the SimBook, its slides, and the Curriculum Map.

Co-Authored-By: Claude Opus 5.5 <noreply@anthropic.com>
Claude-Session: https://claude.ai/code/session_017G5QYgrCTCFugkQCNFUaXc
</commit_message>
<xml_diff>
--- a/courses/data-analytics/output/DataAnalytics-CM-SY2026-2027.docx
+++ b/courses/data-analytics/output/DataAnalytics-CM-SY2026-2027.docx
@@ -3431,7 +3431,7 @@
                 <w:i w:val="0"/>
                 <w:sz w:val="18"/>
               </w:rPr>
-              <w:t>A. What Is Data Analytics?</w:t>
+              <w:t>Lesson 1: What Is Data Analytics?</w:t>
             </w:r>
           </w:p>
           <w:p>
@@ -4139,7 +4139,7 @@
                 <w:i w:val="0"/>
                 <w:sz w:val="18"/>
               </w:rPr>
-              <w:t>B. Data Privacy and Ethics</w:t>
+              <w:t>Lesson 2: Data Privacy and Ethics</w:t>
             </w:r>
           </w:p>
           <w:p>
@@ -4870,7 +4870,7 @@
                 <w:i w:val="0"/>
                 <w:sz w:val="18"/>
               </w:rPr>
-              <w:t>C. Applications and Careers in Data Analytics</w:t>
+              <w:t>Lesson 3: Applications and Careers in Data Analytics</w:t>
             </w:r>
           </w:p>
           <w:p>
@@ -5906,7 +5906,7 @@
                 <w:i w:val="0"/>
                 <w:sz w:val="18"/>
               </w:rPr>
-              <w:t>D. Data Sources and Collection Methods</w:t>
+              <w:t>Lesson 4: Data Sources and Collection Methods</w:t>
             </w:r>
           </w:p>
           <w:p>
@@ -6726,7 +6726,7 @@
                 <w:i w:val="0"/>
                 <w:sz w:val="18"/>
               </w:rPr>
-              <w:t>E. Exploring and Securing Data</w:t>
+              <w:t>Lesson 5: Exploring and Securing Data</w:t>
             </w:r>
           </w:p>
           <w:p>
@@ -8406,7 +8406,7 @@
                 <w:i w:val="0"/>
                 <w:sz w:val="18"/>
               </w:rPr>
-              <w:t>F. Cleaning and Converting Data</w:t>
+              <w:t>Lesson 6: Cleaning and Converting Data</w:t>
             </w:r>
           </w:p>
           <w:p>
@@ -9226,7 +9226,7 @@
                 <w:i w:val="0"/>
                 <w:sz w:val="18"/>
               </w:rPr>
-              <w:t>G. Conditional and Lookup Functions</w:t>
+              <w:t>Lesson 7: Conditional and Lookup Functions</w:t>
             </w:r>
           </w:p>
           <w:p>
@@ -9971,7 +9971,7 @@
                 <w:i w:val="0"/>
                 <w:sz w:val="18"/>
               </w:rPr>
-              <w:t>H. Tables, Pivot Tables, and Aggregation</w:t>
+              <w:t>Lesson 8: Tables, Pivot Tables, and Aggregation</w:t>
             </w:r>
           </w:p>
           <w:p>
@@ -11595,7 +11595,7 @@
                 <w:i w:val="0"/>
                 <w:sz w:val="18"/>
               </w:rPr>
-              <w:t>I. Descriptive Statistics</w:t>
+              <w:t>Lesson 9: Descriptive Statistics</w:t>
             </w:r>
           </w:p>
           <w:p>
@@ -12339,7 +12339,7 @@
                 <w:i w:val="0"/>
                 <w:sz w:val="18"/>
               </w:rPr>
-              <w:t>J. Inferential Statistics</w:t>
+              <w:t>Lesson 10: Inferential Statistics</w:t>
             </w:r>
           </w:p>
           <w:p>
@@ -13943,7 +13943,7 @@
                 <w:i w:val="0"/>
                 <w:sz w:val="18"/>
               </w:rPr>
-              <w:t>K. Visualizing Data in Spreadsheets</w:t>
+              <w:t>Lesson 11: Visualizing Data in Spreadsheets</w:t>
             </w:r>
           </w:p>
           <w:p>
@@ -14754,7 +14754,7 @@
                 <w:i w:val="0"/>
                 <w:sz w:val="18"/>
               </w:rPr>
-              <w:t>L. Interactive Dashboards in Looker Studio</w:t>
+              <w:t>Lesson 12: Interactive Dashboards in Looker Studio</w:t>
             </w:r>
           </w:p>
           <w:p>
@@ -15509,7 +15509,7 @@
                 <w:i w:val="0"/>
                 <w:sz w:val="18"/>
               </w:rPr>
-              <w:t>M. Data Storytelling</w:t>
+              <w:t>Lesson 13: Data Storytelling</w:t>
             </w:r>
           </w:p>
           <w:p>
@@ -16632,7 +16632,7 @@
                 <w:i w:val="0"/>
                 <w:sz w:val="18"/>
               </w:rPr>
-              <w:t>N. Completing the Analytics Project</w:t>
+              <w:t>Lesson 14: Completing the Analytics Project</w:t>
             </w:r>
           </w:p>
           <w:p>
@@ -17253,7 +17253,7 @@
                 <w:i w:val="0"/>
                 <w:sz w:val="18"/>
               </w:rPr>
-              <w:t>O. Independent Peer Verification</w:t>
+              <w:t>Lesson 15: Independent Peer Verification</w:t>
             </w:r>
           </w:p>
           <w:p>

</xml_diff>